<commit_message>
Fix reading references and Python Guide citation
</commit_message>
<xml_diff>
--- a/docs/125785_Python_Lab_Book_Student.docx
+++ b/docs/125785_Python_Lab_Book_Student.docx
@@ -161,7 +161,7 @@
         <w:p>
           <w:r>
             <w:fldChar w:fldCharType="begin" w:dirty="true"/>
-            <w:instrText xml:space="preserve">TOC \o "1-2" \h \z \u</w:instrText>
+            <w:instrText xml:space="preserve">TOC \o "1-3" \h \z \u</w:instrText>
             <w:fldChar w:fldCharType="separate"/>
             <w:fldChar w:fldCharType="end"/>
           </w:r>
@@ -319,7 +319,7 @@
         <w:pStyle w:val="BodyText"/>
       </w:pPr>
       <w:r>
-        <w:t xml:space="preserve">The companion text is Wichmann, R. &amp; Brooks, C.,</w:t>
+        <w:t xml:space="preserve">The companion text is Tao, R. &amp; Brooks, C. (2019),</w:t>
       </w:r>
       <w:r>
         <w:t xml:space="preserve"> </w:t>
@@ -329,13 +329,29 @@
           <w:iCs/>
           <w:i/>
         </w:rPr>
-        <w:t xml:space="preserve">Python Guide for Introductory Econometrics for Finance</w:t>
-      </w:r>
-      <w:r>
-        <w:t xml:space="preserve"> </w:t>
-      </w:r>
-      <w:r>
-        <w:t xml:space="preserve">(Cambridge University Press), which follows the chapters of the course textbook, Brooks (2019). Chapter references to both are given at the start of each session.</w:t>
+        <w:t xml:space="preserve">Python Guide to Accompany Introductory Econometrics for Finance</w:t>
+      </w:r>
+      <w:r>
+        <w:t xml:space="preserve"> </w:t>
+      </w:r>
+      <w:r>
+        <w:t xml:space="preserve">(ICMA Centre, Henley Business School, University of Reading), which follows the chapters of the course textbook, Brooks, C. (2019),</w:t>
+      </w:r>
+      <w:r>
+        <w:t xml:space="preserve"> </w:t>
+      </w:r>
+      <w:r>
+        <w:rPr>
+          <w:iCs/>
+          <w:i/>
+        </w:rPr>
+        <w:t xml:space="preserve">Introductory Econometrics for Finance</w:t>
+      </w:r>
+      <w:r>
+        <w:t xml:space="preserve"> </w:t>
+      </w:r>
+      <w:r>
+        <w:t xml:space="preserve">(4th ed.), Cambridge University Press. Chapter references to both are given at the start of each session.</w:t>
       </w:r>
     </w:p>
     <w:p>
@@ -418,7 +434,7 @@
         <w:rPr>
           <w:rStyle w:val="VerbatimChar"/>
         </w:rPr>
-        <w:t>https://github.com/nquynh/125785-research-analytics</w:t>
+        <w:t xml:space="preserve">https://github.com/nquynh/125785-research-analytics</w:t>
       </w:r>
       <w:r>
         <w:t xml:space="preserve"> </w:t>
@@ -974,7 +990,7 @@
         <w:rPr>
           <w:rStyle w:val="StringTok"/>
         </w:rPr>
-        <w:t>"https://raw.githubusercontent.com/nquynh/125785-research-analytics/main/data/"</w:t>
+        <w:t xml:space="preserve">"https://raw.githubusercontent.com/nquynh/125785-research-analytics/main/data/"</w:t>
       </w:r>
       <w:r>
         <w:rPr>
@@ -5851,7 +5867,7 @@
         <w:t xml:space="preserve"> </w:t>
       </w:r>
       <w:r>
-        <w:t xml:space="preserve">Brooks (2019) Ch. 5; Python Guide Ch. 8–11</w:t>
+        <w:t xml:space="preserve">Brooks (2019) Ch. 5; Python Guide Ch. 10</w:t>
       </w:r>
       <w:r>
         <w:br/>
@@ -7441,7 +7457,7 @@
         <w:t xml:space="preserve"> </w:t>
       </w:r>
       <w:r>
-        <w:t xml:space="preserve">Brooks (2019) Ch. 11 (and 14.8 on Fama–MacBeth); Python Guide Ch. 21</w:t>
+        <w:t xml:space="preserve">Brooks (2019) Ch. 11 and 14.2; Python Guide Ch. 21 and 24</w:t>
       </w:r>
       <w:r>
         <w:br/>
@@ -8596,7 +8612,7 @@
         <w:t xml:space="preserve"> </w:t>
       </w:r>
       <w:r>
-        <w:t xml:space="preserve">Brooks (2019) Ch. 12.1–12.9; Python Guide Ch. 22</w:t>
+        <w:t xml:space="preserve">Brooks (2019) Ch. 12.1–12.2 (review Ch. 5 and 10); Python Guide Ch. 22</w:t>
       </w:r>
       <w:r>
         <w:br/>
@@ -9439,7 +9455,7 @@
         <w:t xml:space="preserve"> </w:t>
       </w:r>
       <w:r>
-        <w:t xml:space="preserve">Brooks (2019) Ch. 6; Python Guide Ch. 12–14</w:t>
+        <w:t xml:space="preserve">Brooks (2019) Ch. 6; Python Guide Ch. 11–12 and 17</w:t>
       </w:r>
       <w:r>
         <w:br/>
@@ -10184,7 +10200,7 @@
         <w:t xml:space="preserve"> </w:t>
       </w:r>
       <w:r>
-        <w:t xml:space="preserve">Brooks (2019) Ch. 7; Python Guide Ch. 16–17</w:t>
+        <w:t xml:space="preserve">Brooks (2019) Ch. 7; Python Guide Ch. 16</w:t>
       </w:r>
       <w:r>
         <w:br/>
@@ -10724,7 +10740,7 @@
         <w:t xml:space="preserve"> </w:t>
       </w:r>
       <w:r>
-        <w:t xml:space="preserve">Brooks (2019) Ch. 14.1–14.2</w:t>
+        <w:t xml:space="preserve">Brooks (2019) Ch. 14.1–14.2 (the Python Guide has no event-study chapter; this notebook is the guide)</w:t>
       </w:r>
       <w:r>
         <w:br/>
@@ -12262,7 +12278,7 @@
         <w:t xml:space="preserve"> </w:t>
       </w:r>
       <w:r>
-        <w:t xml:space="preserve">Brooks (2019) Ch. 7.4–7.7 and special-topic notes</w:t>
+        <w:t xml:space="preserve">Brooks (2019) Ch. 7 (simultaneous equations, instruments, Hausman test) and special-topic notes; Python Guide Ch. 14–15</w:t>
       </w:r>
       <w:r>
         <w:br/>
@@ -13239,7 +13255,7 @@
         <w:t xml:space="preserve"> </w:t>
       </w:r>
       <w:r>
-        <w:t xml:space="preserve">Brooks (2019) Ch. 6.11 and 7.11</w:t>
+        <w:t xml:space="preserve">Brooks (2019) forecasting sections of Ch. 6 and 7 and special-topic notes; Python Guide Ch. 12–13</w:t>
       </w:r>
       <w:r>
         <w:br/>
@@ -15647,15 +15663,13 @@
     <w:link w:val="VerbatimChar"/>
     <w:pPr>
       <w:wordWrap w:val="off"/>
-      <w:shd w:val="clear" w:fill="f8f8f8"/>
     </w:pPr>
   </w:style>
   <w:style w:type="character" w:customStyle="1" w:styleId="KeywordTok">
     <w:name w:val="KeywordTok"/>
     <w:basedOn w:val="VerbatimChar"/>
     <w:rPr>
-      <w:color w:val="204a87"/>
-      <w:shd w:val="clear" w:fill="f8f8f8"/>
+      <w:color w:val="007020"/>
       <w:b/>
     </w:rPr>
   </w:style>
@@ -15663,96 +15677,85 @@
     <w:name w:val="DataTypeTok"/>
     <w:basedOn w:val="VerbatimChar"/>
     <w:rPr>
-      <w:color w:val="204a87"/>
-      <w:shd w:val="clear" w:fill="f8f8f8"/>
+      <w:color w:val="902000"/>
     </w:rPr>
   </w:style>
   <w:style w:type="character" w:customStyle="1" w:styleId="DecValTok">
     <w:name w:val="DecValTok"/>
     <w:basedOn w:val="VerbatimChar"/>
     <w:rPr>
-      <w:color w:val="0000cf"/>
-      <w:shd w:val="clear" w:fill="f8f8f8"/>
+      <w:color w:val="40a070"/>
     </w:rPr>
   </w:style>
   <w:style w:type="character" w:customStyle="1" w:styleId="BaseNTok">
     <w:name w:val="BaseNTok"/>
     <w:basedOn w:val="VerbatimChar"/>
     <w:rPr>
-      <w:color w:val="0000cf"/>
-      <w:shd w:val="clear" w:fill="f8f8f8"/>
+      <w:color w:val="40a070"/>
     </w:rPr>
   </w:style>
   <w:style w:type="character" w:customStyle="1" w:styleId="FloatTok">
     <w:name w:val="FloatTok"/>
     <w:basedOn w:val="VerbatimChar"/>
     <w:rPr>
-      <w:color w:val="0000cf"/>
-      <w:shd w:val="clear" w:fill="f8f8f8"/>
+      <w:color w:val="40a070"/>
     </w:rPr>
   </w:style>
   <w:style w:type="character" w:customStyle="1" w:styleId="ConstantTok">
     <w:name w:val="ConstantTok"/>
     <w:basedOn w:val="VerbatimChar"/>
     <w:rPr>
-      <w:color w:val="8f5902"/>
-      <w:shd w:val="clear" w:fill="f8f8f8"/>
+      <w:color w:val="880000"/>
     </w:rPr>
   </w:style>
   <w:style w:type="character" w:customStyle="1" w:styleId="CharTok">
     <w:name w:val="CharTok"/>
     <w:basedOn w:val="VerbatimChar"/>
     <w:rPr>
-      <w:color w:val="4e9a06"/>
-      <w:shd w:val="clear" w:fill="f8f8f8"/>
+      <w:color w:val="4070a0"/>
     </w:rPr>
   </w:style>
   <w:style w:type="character" w:customStyle="1" w:styleId="SpecialCharTok">
     <w:name w:val="SpecialCharTok"/>
     <w:basedOn w:val="VerbatimChar"/>
     <w:rPr>
-      <w:color w:val="ce5c00"/>
-      <w:shd w:val="clear" w:fill="f8f8f8"/>
-      <w:b/>
+      <w:color w:val="4070a0"/>
     </w:rPr>
   </w:style>
   <w:style w:type="character" w:customStyle="1" w:styleId="StringTok">
     <w:name w:val="StringTok"/>
     <w:basedOn w:val="VerbatimChar"/>
     <w:rPr>
-      <w:color w:val="4e9a06"/>
-      <w:shd w:val="clear" w:fill="f8f8f8"/>
+      <w:color w:val="4070a0"/>
     </w:rPr>
   </w:style>
   <w:style w:type="character" w:customStyle="1" w:styleId="VerbatimStringTok">
     <w:name w:val="VerbatimStringTok"/>
     <w:basedOn w:val="VerbatimChar"/>
     <w:rPr>
-      <w:color w:val="4e9a06"/>
-      <w:shd w:val="clear" w:fill="f8f8f8"/>
+      <w:color w:val="4070a0"/>
     </w:rPr>
   </w:style>
   <w:style w:type="character" w:customStyle="1" w:styleId="SpecialStringTok">
     <w:name w:val="SpecialStringTok"/>
     <w:basedOn w:val="VerbatimChar"/>
     <w:rPr>
-      <w:color w:val="4e9a06"/>
-      <w:shd w:val="clear" w:fill="f8f8f8"/>
+      <w:color w:val="bb6688"/>
     </w:rPr>
   </w:style>
   <w:style w:type="character" w:customStyle="1" w:styleId="ImportTok">
     <w:name w:val="ImportTok"/>
     <w:basedOn w:val="VerbatimChar"/>
     <w:rPr>
-      <w:shd w:val="clear" w:fill="f8f8f8"/>
+      <w:color w:val="008000"/>
+      <w:b/>
     </w:rPr>
   </w:style>
   <w:style w:type="character" w:customStyle="1" w:styleId="CommentTok">
     <w:name w:val="CommentTok"/>
     <w:basedOn w:val="VerbatimChar"/>
     <w:rPr>
-      <w:color w:val="8f5902"/>
-      <w:shd w:val="clear" w:fill="f8f8f8"/>
+      <w:color w:val="60a0b0"/>
       <w:i/>
     </w:rPr>
   </w:style>
@@ -15760,9 +15763,7 @@
     <w:name w:val="DocumentationTok"/>
     <w:basedOn w:val="VerbatimChar"/>
     <w:rPr>
-      <w:color w:val="8f5902"/>
-      <w:shd w:val="clear" w:fill="f8f8f8"/>
-      <w:b/>
+      <w:color w:val="ba2121"/>
       <w:i/>
     </w:rPr>
   </w:style>
@@ -15770,8 +15771,7 @@
     <w:name w:val="AnnotationTok"/>
     <w:basedOn w:val="VerbatimChar"/>
     <w:rPr>
-      <w:color w:val="8f5902"/>
-      <w:shd w:val="clear" w:fill="f8f8f8"/>
+      <w:color w:val="60a0b0"/>
       <w:b/>
       <w:i/>
     </w:rPr>
@@ -15780,8 +15780,7 @@
     <w:name w:val="CommentVarTok"/>
     <w:basedOn w:val="VerbatimChar"/>
     <w:rPr>
-      <w:color w:val="8f5902"/>
-      <w:shd w:val="clear" w:fill="f8f8f8"/>
+      <w:color w:val="60a0b0"/>
       <w:b/>
       <w:i/>
     </w:rPr>
@@ -15790,33 +15789,28 @@
     <w:name w:val="OtherTok"/>
     <w:basedOn w:val="VerbatimChar"/>
     <w:rPr>
-      <w:color w:val="8f5902"/>
-      <w:shd w:val="clear" w:fill="f8f8f8"/>
+      <w:color w:val="007020"/>
     </w:rPr>
   </w:style>
   <w:style w:type="character" w:customStyle="1" w:styleId="FunctionTok">
     <w:name w:val="FunctionTok"/>
     <w:basedOn w:val="VerbatimChar"/>
     <w:rPr>
-      <w:color w:val="204a87"/>
-      <w:shd w:val="clear" w:fill="f8f8f8"/>
-      <w:b/>
+      <w:color w:val="06287e"/>
     </w:rPr>
   </w:style>
   <w:style w:type="character" w:customStyle="1" w:styleId="VariableTok">
     <w:name w:val="VariableTok"/>
     <w:basedOn w:val="VerbatimChar"/>
     <w:rPr>
-      <w:color w:val="000000"/>
-      <w:shd w:val="clear" w:fill="f8f8f8"/>
+      <w:color w:val="19177c"/>
     </w:rPr>
   </w:style>
   <w:style w:type="character" w:customStyle="1" w:styleId="ControlFlowTok">
     <w:name w:val="ControlFlowTok"/>
     <w:basedOn w:val="VerbatimChar"/>
     <w:rPr>
-      <w:color w:val="204a87"/>
-      <w:shd w:val="clear" w:fill="f8f8f8"/>
+      <w:color w:val="007020"/>
       <w:b/>
     </w:rPr>
   </w:style>
@@ -15824,55 +15818,45 @@
     <w:name w:val="OperatorTok"/>
     <w:basedOn w:val="VerbatimChar"/>
     <w:rPr>
-      <w:color w:val="ce5c00"/>
-      <w:shd w:val="clear" w:fill="f8f8f8"/>
-      <w:b/>
+      <w:color w:val="666666"/>
     </w:rPr>
   </w:style>
   <w:style w:type="character" w:customStyle="1" w:styleId="BuiltInTok">
     <w:name w:val="BuiltInTok"/>
     <w:basedOn w:val="VerbatimChar"/>
     <w:rPr>
-      <w:shd w:val="clear" w:fill="f8f8f8"/>
+      <w:color w:val="008000"/>
     </w:rPr>
   </w:style>
   <w:style w:type="character" w:customStyle="1" w:styleId="ExtensionTok">
     <w:name w:val="ExtensionTok"/>
     <w:basedOn w:val="VerbatimChar"/>
-    <w:rPr>
-      <w:shd w:val="clear" w:fill="f8f8f8"/>
-    </w:rPr>
+    <w:rPr/>
   </w:style>
   <w:style w:type="character" w:customStyle="1" w:styleId="PreprocessorTok">
     <w:name w:val="PreprocessorTok"/>
     <w:basedOn w:val="VerbatimChar"/>
     <w:rPr>
-      <w:color w:val="8f5902"/>
-      <w:shd w:val="clear" w:fill="f8f8f8"/>
-      <w:i/>
+      <w:color w:val="bc7a00"/>
     </w:rPr>
   </w:style>
   <w:style w:type="character" w:customStyle="1" w:styleId="AttributeTok">
     <w:name w:val="AttributeTok"/>
     <w:basedOn w:val="VerbatimChar"/>
     <w:rPr>
-      <w:color w:val="204a87"/>
-      <w:shd w:val="clear" w:fill="f8f8f8"/>
+      <w:color w:val="7d9029"/>
     </w:rPr>
   </w:style>
   <w:style w:type="character" w:customStyle="1" w:styleId="RegionMarkerTok">
     <w:name w:val="RegionMarkerTok"/>
     <w:basedOn w:val="VerbatimChar"/>
-    <w:rPr>
-      <w:shd w:val="clear" w:fill="f8f8f8"/>
-    </w:rPr>
+    <w:rPr/>
   </w:style>
   <w:style w:type="character" w:customStyle="1" w:styleId="InformationTok">
     <w:name w:val="InformationTok"/>
     <w:basedOn w:val="VerbatimChar"/>
     <w:rPr>
-      <w:color w:val="8f5902"/>
-      <w:shd w:val="clear" w:fill="f8f8f8"/>
+      <w:color w:val="60a0b0"/>
       <w:b/>
       <w:i/>
     </w:rPr>
@@ -15881,8 +15865,7 @@
     <w:name w:val="WarningTok"/>
     <w:basedOn w:val="VerbatimChar"/>
     <w:rPr>
-      <w:color w:val="8f5902"/>
-      <w:shd w:val="clear" w:fill="f8f8f8"/>
+      <w:color w:val="60a0b0"/>
       <w:b/>
       <w:i/>
     </w:rPr>
@@ -15891,25 +15874,22 @@
     <w:name w:val="AlertTok"/>
     <w:basedOn w:val="VerbatimChar"/>
     <w:rPr>
-      <w:color w:val="ef2929"/>
-      <w:shd w:val="clear" w:fill="f8f8f8"/>
+      <w:color w:val="ff0000"/>
+      <w:b/>
     </w:rPr>
   </w:style>
   <w:style w:type="character" w:customStyle="1" w:styleId="ErrorTok">
     <w:name w:val="ErrorTok"/>
     <w:basedOn w:val="VerbatimChar"/>
     <w:rPr>
-      <w:color w:val="a40000"/>
-      <w:shd w:val="clear" w:fill="f8f8f8"/>
+      <w:color w:val="ff0000"/>
       <w:b/>
     </w:rPr>
   </w:style>
   <w:style w:type="character" w:customStyle="1" w:styleId="NormalTok">
     <w:name w:val="NormalTok"/>
     <w:basedOn w:val="VerbatimChar"/>
-    <w:rPr>
-      <w:shd w:val="clear" w:fill="f8f8f8"/>
-    </w:rPr>
+    <w:rPr/>
   </w:style>
 </w:styles>
 </file>

</xml_diff>